<commit_message>
Pełnomocnictwo: miejsce na baner z logo i tekstowa stopka biura
- narzedzia/zbuduj_szablony.py: baner szablony/grafika/naglowek_filar.png
  (PNG 2480x360) na całą szerokość kartki, gdy plik istnieje; bez pliku
  szablon powstaje jak dotąd
- stopka: 'FILAR-USŁUGI adres:' pogrubione, szary tekst, linia nad
- testy: baner zachowany po wypełnieniu, szablon bez grafiki

Co-Authored-By: Claude Opus 5.5 <noreply@anthropic.com>
Claude-Session: https://claude.ai/code/session_01WAttsbE6YTKznvEWZT3Cuh
</commit_message>
<xml_diff>
--- a/szablony/pelnomocnictwo.docx
+++ b/szablony/pelnomocnictwo.docx
@@ -139,14 +139,26 @@
   <w:p>
     <w:pPr>
       <w:pStyle w:val="Footer"/>
+      <w:spacing w:before="60"/>
       <w:jc w:val="center"/>
+      <w:pBdr>
+        <w:top w:val="single" w:sz="4" w:space="4" w:color="A6A6A6"/>
+      </w:pBdr>
     </w:pPr>
     <w:r>
       <w:rPr>
+        <w:b/>
         <w:color w:val="595959"/>
-        <w:sz w:val="15"/>
-      </w:rPr>
-      <w:t>FILAR-USŁUGI  adres: ul. Sądecka 33h/11, 34-700 Rabka-Zdrój  tel.: 695 770 613, 795 130 812  e-mail: biurofilarmf@gmail.com</w:t>
+        <w:sz w:val="16"/>
+      </w:rPr>
+      <w:t xml:space="preserve">FILAR-USŁUGI adres: </w:t>
+    </w:r>
+    <w:r>
+      <w:rPr>
+        <w:color w:val="595959"/>
+        <w:sz w:val="16"/>
+      </w:rPr>
+      <w:t>ul. Sądecka 33h/11, 34-700 Rabka-Zdrój, tel.: 695 770 613, 795 130 812, e-mail: biurofilarmf@gmail.com</w:t>
     </w:r>
   </w:p>
 </w:ftr>

</xml_diff>

<commit_message>
Pełnomocnictwo: baner FILAR w nagłówku
Grafika z Canvy przycięta do paska 2000x360 px (21 x 3,8 cm), górny
margines strony liczony z proporcji banera.

Co-Authored-By: Claude Opus 5.5 <noreply@anthropic.com>
Claude-Session: https://claude.ai/code/session_01WAttsbE6YTKznvEWZT3Cuh
</commit_message>
<xml_diff>
--- a/szablony/pelnomocnictwo.docx
+++ b/szablony/pelnomocnictwo.docx
@@ -124,9 +124,10 @@
       </w:r>
     </w:p>
     <w:sectPr>
-      <w:footerReference w:type="default" r:id="rId9"/>
+      <w:headerReference w:type="default" r:id="rId9"/>
+      <w:footerReference w:type="default" r:id="rId10"/>
       <w:pgSz w:w="11906" w:h="16838"/>
-      <w:pgMar w:top="1417" w:right="992" w:bottom="850" w:left="1417" w:header="720" w:footer="454" w:gutter="0"/>
+      <w:pgMar w:top="2483" w:right="992" w:bottom="850" w:left="1417" w:header="0" w:footer="454" w:gutter="0"/>
       <w:cols w:space="720"/>
       <w:docGrid w:linePitch="360"/>
     </w:sectPr>
@@ -162,6 +163,52 @@
     </w:r>
   </w:p>
 </w:ftr>
+</file>
+
+<file path=word/header1.xml><?xml version="1.0" encoding="utf-8"?>
+<w:hdr xmlns:m="http://schemas.openxmlformats.org/officeDocument/2006/math" xmlns:mc="http://schemas.openxmlformats.org/markup-compatibility/2006" xmlns:mo="http://schemas.microsoft.com/office/mac/office/2008/main" xmlns:mv="urn:schemas-microsoft-com:mac:vml" xmlns:o="urn:schemas-microsoft-com:office:office" xmlns:r="http://schemas.openxmlformats.org/officeDocument/2006/relationships" xmlns:v="urn:schemas-microsoft-com:vml" xmlns:w10="urn:schemas-microsoft-com:office:word" xmlns:w14="http://schemas.microsoft.com/office/word/2010/wordml" xmlns:w="http://schemas.openxmlformats.org/wordprocessingml/2006/main" xmlns:wne="http://schemas.microsoft.com/office/word/2006/wordml" xmlns:wp14="http://schemas.microsoft.com/office/word/2010/wordprocessingDrawing" xmlns:wp="http://schemas.openxmlformats.org/drawingml/2006/wordprocessingDrawing" xmlns:wpc="http://schemas.microsoft.com/office/word/2010/wordprocessingCanvas" xmlns:wpg="http://schemas.microsoft.com/office/word/2010/wordprocessingGroup" xmlns:wpi="http://schemas.microsoft.com/office/word/2010/wordprocessingInk" xmlns:wps="http://schemas.microsoft.com/office/word/2010/wordprocessingShape" mc:Ignorable="w14 wp14">
+  <w:p>
+    <w:pPr>
+      <w:pStyle w:val="Header"/>
+      <w:spacing w:before="0" w:after="0"/>
+      <w:ind w:left="-1417" w:right="-992"/>
+    </w:pPr>
+    <w:r>
+      <w:drawing>
+        <wp:inline xmlns:a="http://schemas.openxmlformats.org/drawingml/2006/main" xmlns:pic="http://schemas.openxmlformats.org/drawingml/2006/picture">
+          <wp:extent cx="7560310" cy="1360856"/>
+          <wp:docPr id="1" name="Picture 1"/>
+          <wp:cNvGraphicFramePr>
+            <a:graphicFrameLocks noChangeAspect="1"/>
+          </wp:cNvGraphicFramePr>
+          <a:graphic>
+            <a:graphicData uri="http://schemas.openxmlformats.org/drawingml/2006/picture">
+              <pic:pic>
+                <pic:nvPicPr>
+                  <pic:cNvPr id="0" name="naglowek_filar.png"/>
+                  <pic:cNvPicPr/>
+                </pic:nvPicPr>
+                <pic:blipFill>
+                  <a:blip r:embed="rId1"/>
+                  <a:stretch>
+                    <a:fillRect/>
+                  </a:stretch>
+                </pic:blipFill>
+                <pic:spPr>
+                  <a:xfrm>
+                    <a:off x="0" y="0"/>
+                    <a:ext cx="7560310" cy="1360856"/>
+                  </a:xfrm>
+                  <a:prstGeom prst="rect"/>
+                </pic:spPr>
+              </pic:pic>
+            </a:graphicData>
+          </a:graphic>
+        </wp:inline>
+      </w:drawing>
+    </w:r>
+  </w:p>
+</w:hdr>
 </file>
 
 <file path=word/numbering.xml><?xml version="1.0" encoding="utf-8"?>

</xml_diff>